<commit_message>
docs: 리뉴얼 된 CREATE TABLE.docx
</commit_message>
<xml_diff>
--- a/docs/CREATE TABLE.docx
+++ b/docs/CREATE TABLE.docx
@@ -14,15 +14,7 @@
     </w:p>
     <w:p>
       <w:r>
-        <w:t xml:space="preserve">    name </w:t>
-      </w:r>
-      <w:proofErr w:type="gramStart"/>
-      <w:r>
-        <w:t>VARCHAR(</w:t>
-      </w:r>
-      <w:proofErr w:type="gramEnd"/>
-      <w:r>
-        <w:t>32) NOT NULL,</w:t>
+        <w:t xml:space="preserve">    name VARCHAR(32) NOT NULL,</w:t>
       </w:r>
     </w:p>
     <w:p>
@@ -69,15 +61,7 @@
     </w:p>
     <w:p>
       <w:r>
-        <w:t xml:space="preserve">    name </w:t>
-      </w:r>
-      <w:proofErr w:type="gramStart"/>
-      <w:r>
-        <w:t>VARCHAR(</w:t>
-      </w:r>
-      <w:proofErr w:type="gramEnd"/>
-      <w:r>
-        <w:t>32) NOT NULL,</w:t>
+        <w:t xml:space="preserve">    name VARCHAR(32) NOT NULL,</w:t>
       </w:r>
     </w:p>
     <w:p>
@@ -147,12 +131,10 @@
         <w:t xml:space="preserve">    </w:t>
       </w:r>
       <w:proofErr w:type="spellStart"/>
-      <w:proofErr w:type="gramStart"/>
       <w:r>
         <w:t>expirationDate</w:t>
       </w:r>
       <w:proofErr w:type="spellEnd"/>
-      <w:proofErr w:type="gramEnd"/>
       <w:r>
         <w:t xml:space="preserve"> DATE NOT NULL,</w:t>
       </w:r>
@@ -343,15 +325,7 @@
     </w:p>
     <w:p>
       <w:r>
-        <w:t xml:space="preserve">    statement </w:t>
-      </w:r>
-      <w:proofErr w:type="gramStart"/>
-      <w:r>
-        <w:t>VARCHAR(</w:t>
-      </w:r>
-      <w:proofErr w:type="gramEnd"/>
-      <w:r>
-        <w:t>32) NOT NULL,</w:t>
+        <w:t xml:space="preserve">    statement VARCHAR(32) NOT NULL,</w:t>
       </w:r>
     </w:p>
     <w:p>
@@ -666,15 +640,7 @@
     </w:p>
     <w:p>
       <w:r>
-        <w:t xml:space="preserve">    statement </w:t>
-      </w:r>
-      <w:proofErr w:type="gramStart"/>
-      <w:r>
-        <w:t>VARCHAR(</w:t>
-      </w:r>
-      <w:proofErr w:type="gramEnd"/>
-      <w:r>
-        <w:t>32) NOT NULL,</w:t>
+        <w:t xml:space="preserve">    statement VARCHAR(32) NOT NULL,</w:t>
       </w:r>
     </w:p>
     <w:p>
@@ -798,8 +764,89 @@
       </w:r>
     </w:p>
     <w:p>
-      <w:r>
-        <w:t xml:space="preserve">    </w:t>
+      <w:pPr>
+        <w:ind w:firstLineChars="200" w:firstLine="440"/>
+      </w:pPr>
+      <w:r>
+        <w:t>statement VARCHAR(32) NOT NULL,</w:t>
+      </w:r>
+    </w:p>
+    <w:p>
+      <w:r>
+        <w:t xml:space="preserve">    </w:t>
+      </w:r>
+      <w:proofErr w:type="spellStart"/>
+      <w:r>
+        <w:t>originPrice</w:t>
+      </w:r>
+      <w:proofErr w:type="spellEnd"/>
+      <w:r>
+        <w:t xml:space="preserve"> INT NOT NULL,</w:t>
+      </w:r>
+    </w:p>
+    <w:p>
+      <w:r>
+        <w:t xml:space="preserve">    </w:t>
+      </w:r>
+      <w:proofErr w:type="spellStart"/>
+      <w:r>
+        <w:t>discountPrice</w:t>
+      </w:r>
+      <w:proofErr w:type="spellEnd"/>
+      <w:r>
+        <w:t xml:space="preserve"> INT NOT NULL,</w:t>
+      </w:r>
+    </w:p>
+    <w:p>
+      <w:r>
+        <w:t xml:space="preserve">    </w:t>
+      </w:r>
+      <w:proofErr w:type="spellStart"/>
+      <w:r>
+        <w:t>createdAt</w:t>
+      </w:r>
+      <w:proofErr w:type="spellEnd"/>
+      <w:r>
+        <w:t xml:space="preserve"> TIMESTAMP DEFAULT CURRENT_TIMESTAMP,</w:t>
+      </w:r>
+    </w:p>
+    <w:p>
+      <w:r>
+        <w:t xml:space="preserve">    </w:t>
+      </w:r>
+      <w:proofErr w:type="spellStart"/>
+      <w:r>
+        <w:t>updatedAt</w:t>
+      </w:r>
+      <w:proofErr w:type="spellEnd"/>
+      <w:r>
+        <w:t xml:space="preserve"> TIMESTAMP DEFAULT CURRENT_TIMESTAMP ON UPDATE CURRENT_TIMESTAMP,</w:t>
+      </w:r>
+    </w:p>
+    <w:p>
+      <w:r>
+        <w:t xml:space="preserve">    FOREIGN KEY (</w:t>
+      </w:r>
+      <w:proofErr w:type="spellStart"/>
+      <w:r>
+        <w:t>orderId</w:t>
+      </w:r>
+      <w:proofErr w:type="spellEnd"/>
+      <w:r>
+        <w:t xml:space="preserve">) REFERENCES </w:t>
+      </w:r>
+      <w:proofErr w:type="spellStart"/>
+      <w:r>
+        <w:t>order_history</w:t>
+      </w:r>
+      <w:proofErr w:type="spellEnd"/>
+      <w:r>
+        <w:t>(id) ON DELETE CASCADE,</w:t>
+      </w:r>
+    </w:p>
+    <w:p>
+      <w:r>
+        <w:t xml:space="preserve">    FOREIGN KEY (</w:t>
       </w:r>
       <w:proofErr w:type="spellStart"/>
       <w:r>
@@ -807,124 +854,11 @@
       </w:r>
       <w:proofErr w:type="spellEnd"/>
       <w:r>
-        <w:t xml:space="preserve"> BIGINT NOT NULL,</w:t>
-      </w:r>
-    </w:p>
-    <w:p>
-      <w:r>
-        <w:t xml:space="preserve">    </w:t>
-      </w:r>
-      <w:proofErr w:type="spellStart"/>
-      <w:r>
-        <w:t>couponId</w:t>
-      </w:r>
-      <w:proofErr w:type="spellEnd"/>
-      <w:r>
-        <w:t xml:space="preserve"> BIGINT DEFAULT NULL,</w:t>
-      </w:r>
-    </w:p>
-    <w:p>
-      <w:r>
-        <w:t xml:space="preserve">    statement </w:t>
-      </w:r>
-      <w:proofErr w:type="gramStart"/>
-      <w:r>
-        <w:t>VARCHAR(</w:t>
-      </w:r>
-      <w:proofErr w:type="gramEnd"/>
-      <w:r>
-        <w:t>32) NOT NULL,</w:t>
-      </w:r>
-    </w:p>
-    <w:p>
-      <w:r>
-        <w:t xml:space="preserve">    </w:t>
-      </w:r>
-      <w:proofErr w:type="spellStart"/>
-      <w:r>
-        <w:t>originPrice</w:t>
-      </w:r>
-      <w:proofErr w:type="spellEnd"/>
-      <w:r>
-        <w:t xml:space="preserve"> INT NOT NULL,</w:t>
-      </w:r>
-    </w:p>
-    <w:p>
-      <w:r>
-        <w:t xml:space="preserve">    </w:t>
-      </w:r>
-      <w:proofErr w:type="spellStart"/>
-      <w:r>
-        <w:t>discountPrice</w:t>
-      </w:r>
-      <w:proofErr w:type="spellEnd"/>
-      <w:r>
-        <w:t xml:space="preserve"> INT NOT NULL,</w:t>
-      </w:r>
-    </w:p>
-    <w:p>
-      <w:r>
-        <w:t xml:space="preserve">    </w:t>
-      </w:r>
-      <w:proofErr w:type="spellStart"/>
-      <w:r>
-        <w:t>createdAt</w:t>
-      </w:r>
-      <w:proofErr w:type="spellEnd"/>
-      <w:r>
-        <w:t xml:space="preserve"> TIMESTAMP DEFAULT CURRENT_TIMESTAMP,</w:t>
-      </w:r>
-    </w:p>
-    <w:p>
-      <w:r>
-        <w:t xml:space="preserve">    </w:t>
-      </w:r>
-      <w:proofErr w:type="spellStart"/>
-      <w:r>
-        <w:t>updatedAt</w:t>
-      </w:r>
-      <w:proofErr w:type="spellEnd"/>
-      <w:r>
-        <w:t xml:space="preserve"> TIMESTAMP DEFAULT CURRENT_TIMESTAMP ON UPDATE CURRENT_TIMESTAMP,</w:t>
-      </w:r>
-    </w:p>
-    <w:p>
-      <w:r>
-        <w:t xml:space="preserve">    FOREIGN KEY (</w:t>
-      </w:r>
-      <w:proofErr w:type="spellStart"/>
-      <w:r>
-        <w:t>orderId</w:t>
-      </w:r>
-      <w:proofErr w:type="spellEnd"/>
-      <w:r>
-        <w:t xml:space="preserve">) REFERENCES </w:t>
-      </w:r>
-      <w:proofErr w:type="spellStart"/>
-      <w:r>
-        <w:t>order_history</w:t>
-      </w:r>
-      <w:proofErr w:type="spellEnd"/>
-      <w:r>
-        <w:t>(id) ON DELETE CASCADE,</w:t>
-      </w:r>
-    </w:p>
-    <w:p>
-      <w:r>
-        <w:t xml:space="preserve">    FOREIGN KEY (</w:t>
-      </w:r>
-      <w:proofErr w:type="spellStart"/>
-      <w:r>
-        <w:t>productId</w:t>
-      </w:r>
-      <w:proofErr w:type="spellEnd"/>
-      <w:r>
         <w:t>) REFERENCES product(id) ON DELETE CASCADE,</w:t>
       </w:r>
     </w:p>
     <w:p>
       <w:r>
-        <w:lastRenderedPageBreak/>
         <w:t xml:space="preserve">    FOREIGN KEY (</w:t>
       </w:r>
       <w:proofErr w:type="spellStart"/>

</xml_diff>